<commit_message>
feat: implement AR navigation system, stall mapping utilities, and system documentation architecture
</commit_message>
<xml_diff>
--- a/docs/MyTalipapa-DFD-ERD-and-Flowchart.docx
+++ b/docs/MyTalipapa-DFD-ERD-and-Flowchart.docx
@@ -595,7 +595,7 @@
                 <w:sz w:val="19"/>
                 <w:szCs w:val="19"/>
               </w:rPr>
-              <w:t xml:space="preserve">ERD: box + crow's-foot lines</w:t>
+              <w:t xml:space="preserve">ERD: table + crow's-foot lines</w:t>
             </w:r>
           </w:p>
         </w:tc>
@@ -2284,7 +2284,7 @@
       <w:r>
         <w:drawing>
           <wp:inline distT="0" distB="0" distL="0" distR="0">
-            <wp:extent cx="4248150" cy="6667500"/>
+            <wp:extent cx="6019800" cy="5972175"/>
             <wp:effectExtent t="0" r="0" b="0" l="0"/>
             <wp:docPr id="1" name="erd.png" descr="erd.png" title="erd.png"/>
             <wp:cNvGraphicFramePr>
@@ -2309,7 +2309,7 @@
                   <pic:spPr bwMode="auto">
                     <a:xfrm>
                       <a:off x="0" y="0"/>
-                      <a:ext cx="4248150" cy="6667500"/>
+                      <a:ext cx="6019800" cy="5972175"/>
                     </a:xfrm>
                     <a:prstGeom prst="rect">
                       <a:avLst/>
@@ -2367,7 +2367,7 @@
       <w:r>
         <w:drawing>
           <wp:inline distT="0" distB="0" distL="0" distR="0">
-            <wp:extent cx="5943600" cy="3143250"/>
+            <wp:extent cx="6019800" cy="3667125"/>
             <wp:effectExtent t="0" r="0" b="0" l="0"/>
             <wp:docPr id="1" name="dfd-level-0-context.png" descr="dfd-level-0-context.png" title="dfd-level-0-context.png"/>
             <wp:cNvGraphicFramePr>
@@ -2392,7 +2392,7 @@
                   <pic:spPr bwMode="auto">
                     <a:xfrm>
                       <a:off x="0" y="0"/>
-                      <a:ext cx="5943600" cy="3143250"/>
+                      <a:ext cx="6019800" cy="3667125"/>
                     </a:xfrm>
                     <a:prstGeom prst="rect">
                       <a:avLst/>
@@ -2606,7 +2606,7 @@
       <w:r>
         <w:drawing>
           <wp:inline distT="0" distB="0" distL="0" distR="0">
-            <wp:extent cx="5943600" cy="4048125"/>
+            <wp:extent cx="6019800" cy="3619500"/>
             <wp:effectExtent t="0" r="0" b="0" l="0"/>
             <wp:docPr id="1" name="dfd-level-1-system.png" descr="dfd-level-1-system.png" title="dfd-level-1-system.png"/>
             <wp:cNvGraphicFramePr>
@@ -2631,7 +2631,7 @@
                   <pic:spPr bwMode="auto">
                     <a:xfrm>
                       <a:off x="0" y="0"/>
-                      <a:ext cx="5943600" cy="4048125"/>
+                      <a:ext cx="6019800" cy="3619500"/>
                     </a:xfrm>
                     <a:prstGeom prst="rect">
                       <a:avLst/>
@@ -2774,7 +2774,7 @@
       <w:r>
         <w:drawing>
           <wp:inline distT="0" distB="0" distL="0" distR="0">
-            <wp:extent cx="4514850" cy="6667500"/>
+            <wp:extent cx="6019800" cy="3248025"/>
             <wp:effectExtent t="0" r="0" b="0" l="0"/>
             <wp:docPr id="1" name="dfd-level-2-applications.png" descr="dfd-level-2-applications.png" title="dfd-level-2-applications.png"/>
             <wp:cNvGraphicFramePr>
@@ -2799,7 +2799,7 @@
                   <pic:spPr bwMode="auto">
                     <a:xfrm>
                       <a:off x="0" y="0"/>
-                      <a:ext cx="4514850" cy="6667500"/>
+                      <a:ext cx="6019800" cy="3248025"/>
                     </a:xfrm>
                     <a:prstGeom prst="rect">
                       <a:avLst/>
@@ -2925,7 +2925,7 @@
       <w:r>
         <w:drawing>
           <wp:inline distT="0" distB="0" distL="0" distR="0">
-            <wp:extent cx="5943600" cy="2286000"/>
+            <wp:extent cx="6019800" cy="2409825"/>
             <wp:effectExtent t="0" r="0" b="0" l="0"/>
             <wp:docPr id="1" name="dfd-level-3-review.png" descr="dfd-level-3-review.png" title="dfd-level-3-review.png"/>
             <wp:cNvGraphicFramePr>
@@ -2950,7 +2950,7 @@
                   <pic:spPr bwMode="auto">
                     <a:xfrm>
                       <a:off x="0" y="0"/>
-                      <a:ext cx="5943600" cy="2286000"/>
+                      <a:ext cx="6019800" cy="2409825"/>
                     </a:xfrm>
                     <a:prstGeom prst="rect">
                       <a:avLst/>
@@ -3093,7 +3093,7 @@
       <w:r>
         <w:drawing>
           <wp:inline distT="0" distB="0" distL="0" distR="0">
-            <wp:extent cx="5943600" cy="5562600"/>
+            <wp:extent cx="6019800" cy="4067175"/>
             <wp:effectExtent t="0" r="0" b="0" l="0"/>
             <wp:docPr id="1" name="dfd-level-2-navigation.png" descr="dfd-level-2-navigation.png" title="dfd-level-2-navigation.png"/>
             <wp:cNvGraphicFramePr>
@@ -3118,7 +3118,7 @@
                   <pic:spPr bwMode="auto">
                     <a:xfrm>
                       <a:off x="0" y="0"/>
-                      <a:ext cx="5943600" cy="5562600"/>
+                      <a:ext cx="6019800" cy="4067175"/>
                     </a:xfrm>
                     <a:prstGeom prst="rect">
                       <a:avLst/>
@@ -3244,7 +3244,7 @@
       <w:r>
         <w:drawing>
           <wp:inline distT="0" distB="0" distL="0" distR="0">
-            <wp:extent cx="3381375" cy="6667500"/>
+            <wp:extent cx="6019800" cy="6591300"/>
             <wp:effectExtent t="0" r="0" b="0" l="0"/>
             <wp:docPr id="1" name="dfd-level-3-route.png" descr="dfd-level-3-route.png" title="dfd-level-3-route.png"/>
             <wp:cNvGraphicFramePr>
@@ -3269,7 +3269,7 @@
                   <pic:spPr bwMode="auto">
                     <a:xfrm>
                       <a:off x="0" y="0"/>
-                      <a:ext cx="3381375" cy="6667500"/>
+                      <a:ext cx="6019800" cy="6591300"/>
                     </a:xfrm>
                     <a:prstGeom prst="rect">
                       <a:avLst/>
@@ -3327,7 +3327,7 @@
       <w:r>
         <w:drawing>
           <wp:inline distT="0" distB="0" distL="0" distR="0">
-            <wp:extent cx="2847975" cy="6667500"/>
+            <wp:extent cx="4391025" cy="6858000"/>
             <wp:effectExtent t="0" r="0" b="0" l="0"/>
             <wp:docPr id="1" name="process-flowchart-wayfinding.png" descr="process-flowchart-wayfinding.png" title="process-flowchart-wayfinding.png"/>
             <wp:cNvGraphicFramePr>
@@ -3352,7 +3352,7 @@
                   <pic:spPr bwMode="auto">
                     <a:xfrm>
                       <a:off x="0" y="0"/>
-                      <a:ext cx="2847975" cy="6667500"/>
+                      <a:ext cx="4391025" cy="6858000"/>
                     </a:xfrm>
                     <a:prstGeom prst="rect">
                       <a:avLst/>

</xml_diff>